<commit_message>
Expand report: worked map-reduce example + payment-method data-quality insight
</commit_message>
<xml_diff>
--- a/report/IST3134_Taxi_BigData_Report.docx
+++ b/report/IST3134_Taxi_BigData_Report.docx
@@ -586,6 +586,554 @@
     <w:p>
       <w:r>
         <w:t>For comparison we implement the identical logic in Pandas on a single machine. Because 41M rows with derived columns will not comfortably fit in 16 GB of RAM, the Pandas version must be engineered carefully: it reads only the required columns and processes the twelve files one at a time, combining partial aggregates at the end. Spark performs this out-of-core, parallel execution automatically — the extra manual effort on the Pandas side is itself part of the finding.</w:t>
+      </w:r>
+    </w:p>
+    <w:p>
+      <w:pPr>
+        <w:pStyle w:val="Heading2"/>
+      </w:pPr>
+      <w:r>
+        <w:rPr>
+          <w:color w:val="1F4E79"/>
+        </w:rPr>
+        <w:t>3.1 A worked example</w:t>
+      </w:r>
+    </w:p>
+    <w:p>
+      <w:r>
+        <w:t>To make the map-shuffle-reduce flow concrete, consider computing the average tip % per hour from five sample trips. In the map phase each trip is turned into a (key, value) pair keyed on the pickup hour, carrying the tip % and a count of 1:</w:t>
+      </w:r>
+    </w:p>
+    <w:tbl>
+      <w:tblPr>
+        <w:tblStyle w:val="LightGrid-Accent1"/>
+        <w:tblW w:type="auto" w:w="0"/>
+        <w:jc w:val="center"/>
+        <w:tblLook w:firstColumn="1" w:firstRow="1" w:lastColumn="0" w:lastRow="0" w:noHBand="0" w:noVBand="1" w:val="04A0"/>
+      </w:tblPr>
+      <w:tblGrid>
+        <w:gridCol w:w="2160"/>
+        <w:gridCol w:w="2160"/>
+        <w:gridCol w:w="2160"/>
+        <w:gridCol w:w="2160"/>
+      </w:tblGrid>
+      <w:tr>
+        <w:tc>
+          <w:tcPr>
+            <w:tcW w:type="dxa" w:w="2160"/>
+          </w:tcPr>
+          <w:p>
+            <w:r>
+              <w:rPr>
+                <w:b/>
+                <w:sz w:val="18"/>
+              </w:rPr>
+              <w:t>Trip</w:t>
+            </w:r>
+          </w:p>
+        </w:tc>
+        <w:tc>
+          <w:tcPr>
+            <w:tcW w:type="dxa" w:w="2160"/>
+          </w:tcPr>
+          <w:p>
+            <w:r>
+              <w:rPr>
+                <w:b/>
+                <w:sz w:val="18"/>
+              </w:rPr>
+              <w:t>Pickup hour</w:t>
+            </w:r>
+          </w:p>
+        </w:tc>
+        <w:tc>
+          <w:tcPr>
+            <w:tcW w:type="dxa" w:w="2160"/>
+          </w:tcPr>
+          <w:p>
+            <w:r>
+              <w:rPr>
+                <w:b/>
+                <w:sz w:val="18"/>
+              </w:rPr>
+              <w:t>tip %</w:t>
+            </w:r>
+          </w:p>
+        </w:tc>
+        <w:tc>
+          <w:tcPr>
+            <w:tcW w:type="dxa" w:w="2160"/>
+          </w:tcPr>
+          <w:p>
+            <w:r>
+              <w:rPr>
+                <w:b/>
+                <w:sz w:val="18"/>
+              </w:rPr>
+              <w:t>Map output (key → value)</w:t>
+            </w:r>
+          </w:p>
+        </w:tc>
+      </w:tr>
+      <w:tr>
+        <w:tc>
+          <w:tcPr>
+            <w:tcW w:type="dxa" w:w="2160"/>
+          </w:tcPr>
+          <w:p>
+            <w:r>
+              <w:rPr>
+                <w:sz w:val="18"/>
+              </w:rPr>
+              <w:t>A</w:t>
+            </w:r>
+          </w:p>
+        </w:tc>
+        <w:tc>
+          <w:tcPr>
+            <w:tcW w:type="dxa" w:w="2160"/>
+          </w:tcPr>
+          <w:p>
+            <w:r>
+              <w:rPr>
+                <w:sz w:val="18"/>
+              </w:rPr>
+              <w:t>18</w:t>
+            </w:r>
+          </w:p>
+        </w:tc>
+        <w:tc>
+          <w:tcPr>
+            <w:tcW w:type="dxa" w:w="2160"/>
+          </w:tcPr>
+          <w:p>
+            <w:r>
+              <w:rPr>
+                <w:sz w:val="18"/>
+              </w:rPr>
+              <w:t>20.00</w:t>
+            </w:r>
+          </w:p>
+        </w:tc>
+        <w:tc>
+          <w:tcPr>
+            <w:tcW w:type="dxa" w:w="2160"/>
+          </w:tcPr>
+          <w:p>
+            <w:r>
+              <w:rPr>
+                <w:sz w:val="18"/>
+              </w:rPr>
+              <w:t>18 → (20.0, 1)</w:t>
+            </w:r>
+          </w:p>
+        </w:tc>
+      </w:tr>
+      <w:tr>
+        <w:tc>
+          <w:tcPr>
+            <w:tcW w:type="dxa" w:w="2160"/>
+          </w:tcPr>
+          <w:p>
+            <w:r>
+              <w:rPr>
+                <w:sz w:val="18"/>
+              </w:rPr>
+              <w:t>B</w:t>
+            </w:r>
+          </w:p>
+        </w:tc>
+        <w:tc>
+          <w:tcPr>
+            <w:tcW w:type="dxa" w:w="2160"/>
+          </w:tcPr>
+          <w:p>
+            <w:r>
+              <w:rPr>
+                <w:sz w:val="18"/>
+              </w:rPr>
+              <w:t>9</w:t>
+            </w:r>
+          </w:p>
+        </w:tc>
+        <w:tc>
+          <w:tcPr>
+            <w:tcW w:type="dxa" w:w="2160"/>
+          </w:tcPr>
+          <w:p>
+            <w:r>
+              <w:rPr>
+                <w:sz w:val="18"/>
+              </w:rPr>
+              <w:t>15.00</w:t>
+            </w:r>
+          </w:p>
+        </w:tc>
+        <w:tc>
+          <w:tcPr>
+            <w:tcW w:type="dxa" w:w="2160"/>
+          </w:tcPr>
+          <w:p>
+            <w:r>
+              <w:rPr>
+                <w:sz w:val="18"/>
+              </w:rPr>
+              <w:t>9 → (15.0, 1)</w:t>
+            </w:r>
+          </w:p>
+        </w:tc>
+      </w:tr>
+      <w:tr>
+        <w:tc>
+          <w:tcPr>
+            <w:tcW w:type="dxa" w:w="2160"/>
+          </w:tcPr>
+          <w:p>
+            <w:r>
+              <w:rPr>
+                <w:sz w:val="18"/>
+              </w:rPr>
+              <w:t>C</w:t>
+            </w:r>
+          </w:p>
+        </w:tc>
+        <w:tc>
+          <w:tcPr>
+            <w:tcW w:type="dxa" w:w="2160"/>
+          </w:tcPr>
+          <w:p>
+            <w:r>
+              <w:rPr>
+                <w:sz w:val="18"/>
+              </w:rPr>
+              <w:t>18</w:t>
+            </w:r>
+          </w:p>
+        </w:tc>
+        <w:tc>
+          <w:tcPr>
+            <w:tcW w:type="dxa" w:w="2160"/>
+          </w:tcPr>
+          <w:p>
+            <w:r>
+              <w:rPr>
+                <w:sz w:val="18"/>
+              </w:rPr>
+              <w:t>30.00</w:t>
+            </w:r>
+          </w:p>
+        </w:tc>
+        <w:tc>
+          <w:tcPr>
+            <w:tcW w:type="dxa" w:w="2160"/>
+          </w:tcPr>
+          <w:p>
+            <w:r>
+              <w:rPr>
+                <w:sz w:val="18"/>
+              </w:rPr>
+              <w:t>18 → (30.0, 1)</w:t>
+            </w:r>
+          </w:p>
+        </w:tc>
+      </w:tr>
+      <w:tr>
+        <w:tc>
+          <w:tcPr>
+            <w:tcW w:type="dxa" w:w="2160"/>
+          </w:tcPr>
+          <w:p>
+            <w:r>
+              <w:rPr>
+                <w:sz w:val="18"/>
+              </w:rPr>
+              <w:t>D</w:t>
+            </w:r>
+          </w:p>
+        </w:tc>
+        <w:tc>
+          <w:tcPr>
+            <w:tcW w:type="dxa" w:w="2160"/>
+          </w:tcPr>
+          <w:p>
+            <w:r>
+              <w:rPr>
+                <w:sz w:val="18"/>
+              </w:rPr>
+              <w:t>9</w:t>
+            </w:r>
+          </w:p>
+        </w:tc>
+        <w:tc>
+          <w:tcPr>
+            <w:tcW w:type="dxa" w:w="2160"/>
+          </w:tcPr>
+          <w:p>
+            <w:r>
+              <w:rPr>
+                <w:sz w:val="18"/>
+              </w:rPr>
+              <w:t>25.00</w:t>
+            </w:r>
+          </w:p>
+        </w:tc>
+        <w:tc>
+          <w:tcPr>
+            <w:tcW w:type="dxa" w:w="2160"/>
+          </w:tcPr>
+          <w:p>
+            <w:r>
+              <w:rPr>
+                <w:sz w:val="18"/>
+              </w:rPr>
+              <w:t>9 → (25.0, 1)</w:t>
+            </w:r>
+          </w:p>
+        </w:tc>
+      </w:tr>
+      <w:tr>
+        <w:tc>
+          <w:tcPr>
+            <w:tcW w:type="dxa" w:w="2160"/>
+          </w:tcPr>
+          <w:p>
+            <w:r>
+              <w:rPr>
+                <w:sz w:val="18"/>
+              </w:rPr>
+              <w:t>E</w:t>
+            </w:r>
+          </w:p>
+        </w:tc>
+        <w:tc>
+          <w:tcPr>
+            <w:tcW w:type="dxa" w:w="2160"/>
+          </w:tcPr>
+          <w:p>
+            <w:r>
+              <w:rPr>
+                <w:sz w:val="18"/>
+              </w:rPr>
+              <w:t>18</w:t>
+            </w:r>
+          </w:p>
+        </w:tc>
+        <w:tc>
+          <w:tcPr>
+            <w:tcW w:type="dxa" w:w="2160"/>
+          </w:tcPr>
+          <w:p>
+            <w:r>
+              <w:rPr>
+                <w:sz w:val="18"/>
+              </w:rPr>
+              <w:t>22.00</w:t>
+            </w:r>
+          </w:p>
+        </w:tc>
+        <w:tc>
+          <w:tcPr>
+            <w:tcW w:type="dxa" w:w="2160"/>
+          </w:tcPr>
+          <w:p>
+            <w:r>
+              <w:rPr>
+                <w:sz w:val="18"/>
+              </w:rPr>
+              <w:t>18 → (22.0, 1)</w:t>
+            </w:r>
+          </w:p>
+        </w:tc>
+      </w:tr>
+    </w:tbl>
+    <w:p>
+      <w:r>
+        <w:t>The shuffle phase then groups all values that share a key onto the same reducer — the trips for hour 18 land together, and likewise for hour 9. Finally the reduce phase sums the tip percentages and the counts per key and divides to get the average:</w:t>
+      </w:r>
+    </w:p>
+    <w:tbl>
+      <w:tblPr>
+        <w:tblStyle w:val="LightGrid-Accent1"/>
+        <w:tblW w:type="auto" w:w="0"/>
+        <w:jc w:val="center"/>
+        <w:tblLook w:firstColumn="1" w:firstRow="1" w:lastColumn="0" w:lastRow="0" w:noHBand="0" w:noVBand="1" w:val="04A0"/>
+      </w:tblPr>
+      <w:tblGrid>
+        <w:gridCol w:w="2160"/>
+        <w:gridCol w:w="2160"/>
+        <w:gridCol w:w="2160"/>
+        <w:gridCol w:w="2160"/>
+      </w:tblGrid>
+      <w:tr>
+        <w:tc>
+          <w:tcPr>
+            <w:tcW w:type="dxa" w:w="2160"/>
+          </w:tcPr>
+          <w:p>
+            <w:r>
+              <w:rPr>
+                <w:b/>
+                <w:sz w:val="18"/>
+              </w:rPr>
+              <w:t>Hour (key)</w:t>
+            </w:r>
+          </w:p>
+        </w:tc>
+        <w:tc>
+          <w:tcPr>
+            <w:tcW w:type="dxa" w:w="2160"/>
+          </w:tcPr>
+          <w:p>
+            <w:r>
+              <w:rPr>
+                <w:b/>
+                <w:sz w:val="18"/>
+              </w:rPr>
+              <w:t>Values after shuffle</w:t>
+            </w:r>
+          </w:p>
+        </w:tc>
+        <w:tc>
+          <w:tcPr>
+            <w:tcW w:type="dxa" w:w="2160"/>
+          </w:tcPr>
+          <w:p>
+            <w:r>
+              <w:rPr>
+                <w:b/>
+                <w:sz w:val="18"/>
+              </w:rPr>
+              <w:t>Reduce: sum tip% / sum count</w:t>
+            </w:r>
+          </w:p>
+        </w:tc>
+        <w:tc>
+          <w:tcPr>
+            <w:tcW w:type="dxa" w:w="2160"/>
+          </w:tcPr>
+          <w:p>
+            <w:r>
+              <w:rPr>
+                <w:b/>
+                <w:sz w:val="18"/>
+              </w:rPr>
+              <w:t>Avg tip %</w:t>
+            </w:r>
+          </w:p>
+        </w:tc>
+      </w:tr>
+      <w:tr>
+        <w:tc>
+          <w:tcPr>
+            <w:tcW w:type="dxa" w:w="2160"/>
+          </w:tcPr>
+          <w:p>
+            <w:r>
+              <w:rPr>
+                <w:sz w:val="18"/>
+              </w:rPr>
+              <w:t>9</w:t>
+            </w:r>
+          </w:p>
+        </w:tc>
+        <w:tc>
+          <w:tcPr>
+            <w:tcW w:type="dxa" w:w="2160"/>
+          </w:tcPr>
+          <w:p>
+            <w:r>
+              <w:rPr>
+                <w:sz w:val="18"/>
+              </w:rPr>
+              <w:t>(15.0,1),(25.0,1)</w:t>
+            </w:r>
+          </w:p>
+        </w:tc>
+        <w:tc>
+          <w:tcPr>
+            <w:tcW w:type="dxa" w:w="2160"/>
+          </w:tcPr>
+          <w:p>
+            <w:r>
+              <w:rPr>
+                <w:sz w:val="18"/>
+              </w:rPr>
+              <w:t>40.0 / 2</w:t>
+            </w:r>
+          </w:p>
+        </w:tc>
+        <w:tc>
+          <w:tcPr>
+            <w:tcW w:type="dxa" w:w="2160"/>
+          </w:tcPr>
+          <w:p>
+            <w:r>
+              <w:rPr>
+                <w:sz w:val="18"/>
+              </w:rPr>
+              <w:t>20.00</w:t>
+            </w:r>
+          </w:p>
+        </w:tc>
+      </w:tr>
+      <w:tr>
+        <w:tc>
+          <w:tcPr>
+            <w:tcW w:type="dxa" w:w="2160"/>
+          </w:tcPr>
+          <w:p>
+            <w:r>
+              <w:rPr>
+                <w:sz w:val="18"/>
+              </w:rPr>
+              <w:t>18</w:t>
+            </w:r>
+          </w:p>
+        </w:tc>
+        <w:tc>
+          <w:tcPr>
+            <w:tcW w:type="dxa" w:w="2160"/>
+          </w:tcPr>
+          <w:p>
+            <w:r>
+              <w:rPr>
+                <w:sz w:val="18"/>
+              </w:rPr>
+              <w:t>(20.0,1),(30.0,1),(22.0,1)</w:t>
+            </w:r>
+          </w:p>
+        </w:tc>
+        <w:tc>
+          <w:tcPr>
+            <w:tcW w:type="dxa" w:w="2160"/>
+          </w:tcPr>
+          <w:p>
+            <w:r>
+              <w:rPr>
+                <w:sz w:val="18"/>
+              </w:rPr>
+              <w:t>72.0 / 3</w:t>
+            </w:r>
+          </w:p>
+        </w:tc>
+        <w:tc>
+          <w:tcPr>
+            <w:tcW w:type="dxa" w:w="2160"/>
+          </w:tcPr>
+          <w:p>
+            <w:r>
+              <w:rPr>
+                <w:sz w:val="18"/>
+              </w:rPr>
+              <w:t>24.00</w:t>
+            </w:r>
+          </w:p>
+        </w:tc>
+      </w:tr>
+    </w:tbl>
+    <w:p>
+      <w:r>
+        <w:t>This is exactly what runs at scale in our Spark job — only instead of five rows on one machine, the 35.6M cleaned trips are split into partitions, mapped in parallel across all cores, shuffled by key, and reduced. Because each partition is mapped independently, the work scales almost linearly with the number of cores or machines available — the property that makes the approach a “big data” solution.</w:t>
       </w:r>
     </w:p>
     <w:p>
@@ -2015,7 +2563,295 @@
         <w:rPr>
           <w:color w:val="1F4E79"/>
         </w:rPr>
-        <w:t>4.4 Engine comparison: PySpark vs Pandas</w:t>
+        <w:t>4.4 Tipping by payment method — a data-quality insight</w:t>
+      </w:r>
+    </w:p>
+    <w:tbl>
+      <w:tblPr>
+        <w:tblStyle w:val="LightGrid-Accent1"/>
+        <w:tblW w:type="auto" w:w="0"/>
+        <w:jc w:val="center"/>
+        <w:tblLook w:firstColumn="1" w:firstRow="1" w:lastColumn="0" w:lastRow="0" w:noHBand="0" w:noVBand="1" w:val="04A0"/>
+      </w:tblPr>
+      <w:tblGrid>
+        <w:gridCol w:w="2880"/>
+        <w:gridCol w:w="2880"/>
+        <w:gridCol w:w="2880"/>
+      </w:tblGrid>
+      <w:tr>
+        <w:tc>
+          <w:tcPr>
+            <w:tcW w:type="dxa" w:w="2880"/>
+          </w:tcPr>
+          <w:p>
+            <w:r>
+              <w:rPr>
+                <w:b/>
+                <w:sz w:val="18"/>
+              </w:rPr>
+              <w:t>Payment method</w:t>
+            </w:r>
+          </w:p>
+        </w:tc>
+        <w:tc>
+          <w:tcPr>
+            <w:tcW w:type="dxa" w:w="2880"/>
+          </w:tcPr>
+          <w:p>
+            <w:r>
+              <w:rPr>
+                <w:b/>
+                <w:sz w:val="18"/>
+              </w:rPr>
+              <w:t>trips</w:t>
+            </w:r>
+          </w:p>
+        </w:tc>
+        <w:tc>
+          <w:tcPr>
+            <w:tcW w:type="dxa" w:w="2880"/>
+          </w:tcPr>
+          <w:p>
+            <w:r>
+              <w:rPr>
+                <w:b/>
+                <w:sz w:val="18"/>
+              </w:rPr>
+              <w:t>avg_tip_pct</w:t>
+            </w:r>
+          </w:p>
+        </w:tc>
+      </w:tr>
+      <w:tr>
+        <w:tc>
+          <w:tcPr>
+            <w:tcW w:type="dxa" w:w="2880"/>
+          </w:tcPr>
+          <w:p>
+            <w:r>
+              <w:rPr>
+                <w:sz w:val="18"/>
+              </w:rPr>
+              <w:t>Credit card</w:t>
+            </w:r>
+          </w:p>
+        </w:tc>
+        <w:tc>
+          <w:tcPr>
+            <w:tcW w:type="dxa" w:w="2880"/>
+          </w:tcPr>
+          <w:p>
+            <w:r>
+              <w:rPr>
+                <w:sz w:val="18"/>
+              </w:rPr>
+              <w:t>29,875,493</w:t>
+            </w:r>
+          </w:p>
+        </w:tc>
+        <w:tc>
+          <w:tcPr>
+            <w:tcW w:type="dxa" w:w="2880"/>
+          </w:tcPr>
+          <w:p>
+            <w:r>
+              <w:rPr>
+                <w:sz w:val="18"/>
+              </w:rPr>
+              <w:t>25.10</w:t>
+            </w:r>
+          </w:p>
+        </w:tc>
+      </w:tr>
+      <w:tr>
+        <w:tc>
+          <w:tcPr>
+            <w:tcW w:type="dxa" w:w="2880"/>
+          </w:tcPr>
+          <w:p>
+            <w:r>
+              <w:rPr>
+                <w:sz w:val="18"/>
+              </w:rPr>
+              <w:t>Cash</w:t>
+            </w:r>
+          </w:p>
+        </w:tc>
+        <w:tc>
+          <w:tcPr>
+            <w:tcW w:type="dxa" w:w="2880"/>
+          </w:tcPr>
+          <w:p>
+            <w:r>
+              <w:rPr>
+                <w:sz w:val="18"/>
+              </w:rPr>
+              <w:t>5,218,952</w:t>
+            </w:r>
+          </w:p>
+        </w:tc>
+        <w:tc>
+          <w:tcPr>
+            <w:tcW w:type="dxa" w:w="2880"/>
+          </w:tcPr>
+          <w:p>
+            <w:r>
+              <w:rPr>
+                <w:sz w:val="18"/>
+              </w:rPr>
+              <w:t>0.00</w:t>
+            </w:r>
+          </w:p>
+        </w:tc>
+      </w:tr>
+      <w:tr>
+        <w:tc>
+          <w:tcPr>
+            <w:tcW w:type="dxa" w:w="2880"/>
+          </w:tcPr>
+          <w:p>
+            <w:r>
+              <w:rPr>
+                <w:sz w:val="18"/>
+              </w:rPr>
+              <w:t>No charge</w:t>
+            </w:r>
+          </w:p>
+        </w:tc>
+        <w:tc>
+          <w:tcPr>
+            <w:tcW w:type="dxa" w:w="2880"/>
+          </w:tcPr>
+          <w:p>
+            <w:r>
+              <w:rPr>
+                <w:sz w:val="18"/>
+              </w:rPr>
+              <w:t>149,706</w:t>
+            </w:r>
+          </w:p>
+        </w:tc>
+        <w:tc>
+          <w:tcPr>
+            <w:tcW w:type="dxa" w:w="2880"/>
+          </w:tcPr>
+          <w:p>
+            <w:r>
+              <w:rPr>
+                <w:sz w:val="18"/>
+              </w:rPr>
+              <w:t>0.06</w:t>
+            </w:r>
+          </w:p>
+        </w:tc>
+      </w:tr>
+      <w:tr>
+        <w:tc>
+          <w:tcPr>
+            <w:tcW w:type="dxa" w:w="2880"/>
+          </w:tcPr>
+          <w:p>
+            <w:r>
+              <w:rPr>
+                <w:sz w:val="18"/>
+              </w:rPr>
+              <w:t>Dispute</w:t>
+            </w:r>
+          </w:p>
+        </w:tc>
+        <w:tc>
+          <w:tcPr>
+            <w:tcW w:type="dxa" w:w="2880"/>
+          </w:tcPr>
+          <w:p>
+            <w:r>
+              <w:rPr>
+                <w:sz w:val="18"/>
+              </w:rPr>
+              <w:t>384,278</w:t>
+            </w:r>
+          </w:p>
+        </w:tc>
+        <w:tc>
+          <w:tcPr>
+            <w:tcW w:type="dxa" w:w="2880"/>
+          </w:tcPr>
+          <w:p>
+            <w:r>
+              <w:rPr>
+                <w:sz w:val="18"/>
+              </w:rPr>
+              <w:t>0.06</w:t>
+            </w:r>
+          </w:p>
+        </w:tc>
+      </w:tr>
+    </w:tbl>
+    <w:p>
+      <w:pPr>
+        <w:jc w:val="center"/>
+      </w:pPr>
+      <w:r>
+        <w:drawing>
+          <wp:inline xmlns:a="http://schemas.openxmlformats.org/drawingml/2006/main" xmlns:pic="http://schemas.openxmlformats.org/drawingml/2006/picture">
+            <wp:extent cx="5669280" cy="3188970"/>
+            <wp:docPr id="4" name="Picture 4"/>
+            <wp:cNvGraphicFramePr>
+              <a:graphicFrameLocks noChangeAspect="1"/>
+            </wp:cNvGraphicFramePr>
+            <a:graphic>
+              <a:graphicData uri="http://schemas.openxmlformats.org/drawingml/2006/picture">
+                <pic:pic>
+                  <pic:nvPicPr>
+                    <pic:cNvPr id="0" name="fig5_payment.png"/>
+                    <pic:cNvPicPr/>
+                  </pic:nvPicPr>
+                  <pic:blipFill>
+                    <a:blip r:embed="rId12"/>
+                    <a:stretch>
+                      <a:fillRect/>
+                    </a:stretch>
+                  </pic:blipFill>
+                  <pic:spPr>
+                    <a:xfrm>
+                      <a:off x="0" y="0"/>
+                      <a:ext cx="5669280" cy="3188970"/>
+                    </a:xfrm>
+                    <a:prstGeom prst="rect"/>
+                  </pic:spPr>
+                </pic:pic>
+              </a:graphicData>
+            </a:graphic>
+          </wp:inline>
+        </w:drawing>
+      </w:r>
+    </w:p>
+    <w:p>
+      <w:pPr>
+        <w:jc w:val="center"/>
+      </w:pPr>
+      <w:r>
+        <w:rPr>
+          <w:i/>
+          <w:sz w:val="18"/>
+        </w:rPr>
+        <w:t>Figure 5. Average tip % by payment method.</w:t>
+      </w:r>
+    </w:p>
+    <w:p>
+      <w:r>
+        <w:t>This breakdown exposes an important characteristic of the data. Credit-card trips (29.9M, the large majority) average a 25.1% tip, but cash trips (5.2M) record an average tip of 0.0%. Cash passengers obviously do tip — the explanation is that the TLC data set only captures tips entered through the card reader; cash tips are never recorded. This matters for interpretation: the ~21% blended tip average reported earlier is diluted by cash trips showing as zero, so the true card-tipping rate (25.1%) is the more meaningful figure. Recognising this prevents a wrong conclusion and demonstrates why understanding how data is collected is as important as the analysis itself.</w:t>
+      </w:r>
+    </w:p>
+    <w:p>
+      <w:pPr>
+        <w:pStyle w:val="Heading2"/>
+      </w:pPr>
+      <w:r>
+        <w:rPr>
+          <w:color w:val="1F4E79"/>
+        </w:rPr>
+        <w:t>4.5 Engine comparison: PySpark vs Pandas</w:t>
       </w:r>
     </w:p>
     <w:tbl>
@@ -2381,7 +3217,7 @@
         <w:drawing>
           <wp:inline xmlns:a="http://schemas.openxmlformats.org/drawingml/2006/main" xmlns:pic="http://schemas.openxmlformats.org/drawingml/2006/picture">
             <wp:extent cx="5669280" cy="2125980"/>
-            <wp:docPr id="4" name="Picture 4"/>
+            <wp:docPr id="5" name="Picture 5"/>
             <wp:cNvGraphicFramePr>
               <a:graphicFrameLocks noChangeAspect="1"/>
             </wp:cNvGraphicFramePr>
@@ -2393,7 +3229,7 @@
                     <pic:cNvPicPr/>
                   </pic:nvPicPr>
                   <pic:blipFill>
-                    <a:blip r:embed="rId12"/>
+                    <a:blip r:embed="rId13"/>
                     <a:stretch>
                       <a:fillRect/>
                     </a:stretch>

</xml_diff>

<commit_message>
Add GitHub URL and draft individual reflections
</commit_message>
<xml_diff>
--- a/report/IST3134_Taxi_BigData_Report.docx
+++ b/report/IST3134_Taxi_BigData_Report.docx
@@ -101,7 +101,7 @@
         <w:rPr>
           <w:sz w:val="24"/>
         </w:rPr>
-        <w:t>Source code &amp; dataset: https://github.com/&lt;your-username&gt;/nyc-taxi-bigdata</w:t>
+        <w:t>Source code &amp; dataset: https://github.com/brvndonpek/nyc-taxi-bigdata</w:t>
       </w:r>
     </w:p>
     <w:p>
@@ -3283,7 +3283,10 @@
     </w:p>
     <w:p>
       <w:r>
-        <w:t>(Each team member writes their own reflection — around 200–300 words — relating what they personally learned to the results above. Replace the placeholders below. The marking scheme rewards reflections that connect to the actual results obtained, not general statements.)</w:t>
+        <w:rPr>
+          <w:i/>
+        </w:rPr>
+        <w:t>NOTE TO AUTHORS: the two reflections below are drafts grounded in the real work done in this project. Personalise them in your own words and adjust any detail (e.g. which part you personally handled) before submitting — reflections should be individual. Delete this note.</w:t>
       </w:r>
     </w:p>
     <w:p>
@@ -3299,12 +3302,7 @@
     </w:p>
     <w:p>
       <w:r>
-        <w:t>Prompt ideas: What did you learn about the MapReduce/Spark model? What surprised you in the results (e.g. that Pandas beat Spark on small data, or the airport tipping pattern)? What was difficult (Java/Spark setup, memory limits, data cleaning)? How would this change for a truly cluster-scale dataset? What would you do differently next time?</w:t>
-      </w:r>
-    </w:p>
-    <w:p>
-      <w:r>
-        <w:t>[ Your reflection here. ]</w:t>
+        <w:t>The biggest thing I took away from this assignment is that “big data” is about scalability, not raw speed. Before starting, I assumed Spark would always beat Pandas. Our benchmark proved the opposite for small data: on a single month Pandas finished in 0.2 s while Spark took 3.4 s because of its fixed start-up cost (the JVM, query planner and shuffle setup). Only as the data grew to the full 35.6M rows did Spark pull clearly ahead (1.0 s vs 3.0 s). What really made the point was memory: Pandas' peak usage rose linearly to almost 4 GB, and we could see that at roughly five times the data it would exceed our 16 GB laptop and simply crash, whereas Spark's runtime stayed flat. That is the moment the value of a distributed engine clicked for me — it is what lets you process data that does not fit in memory, and scale the same code out to a cluster. Understanding the map-shuffle-reduce model also helped me see why our groupBy queries parallelise so well: each partition is mapped independently before the shuffle. If I did this again I would run it on a real cloud cluster (e.g. AWS EMR or Databricks) with a much larger dataset, because that is where Spark's advantage would be dramatic rather than marginal. (Approx. 230 words — edit to your own experience.)</w:t>
       </w:r>
     </w:p>
     <w:p>
@@ -3320,12 +3318,7 @@
     </w:p>
     <w:p>
       <w:r>
-        <w:t>Prompt ideas: What did you learn about the MapReduce/Spark model? What surprised you in the results (e.g. that Pandas beat Spark on small data, or the airport tipping pattern)? What was difficult (Java/Spark setup, memory limits, data cleaning)? How would this change for a truly cluster-scale dataset? What would you do differently next time?</w:t>
-      </w:r>
-    </w:p>
-    <w:p>
-      <w:r>
-        <w:t>[ Your reflection here. ]</w:t>
+        <w:t>My main lesson was that understanding the data matters as much as the processing technology. When we first computed the average tip we got about 21%, but breaking it down by payment method revealed that cash trips recorded a 0% tip. Cash riders clearly do tip — the TLC data only captures tips entered on the card reader — so the honest figure is the 25.1% card-tipping rate. Catching that stopped us from reporting a misleading number, and it taught me to always ask how a dataset was collected. I also learned a lot from the practical setup: Spark needs a Java runtime, and getting the environment right (installing Java 17 and pointing Spark at it) was a real hurdle before any analysis could run. Data cleaning was another eye-opener — 13.5% of the raw rows were invalid (zero fares, zero-distance or impossible trips), and applying the exact same filters in both the Spark and Pandas versions was essential to make the comparison fair. Seeing both engines produce identical numbers gave me confidence the logic was correct. Next time I would add trip-duration and speed analysis and visualise pickups on a map of the NYC zones, since the location data is rich and we only used part of it. (Approx. 230 words — edit to your own experience.)</w:t>
       </w:r>
     </w:p>
     <w:p>

</xml_diff>